<commit_message>
docs: matriz de criterios con el fondo de color del estado (A verde) como en la plantilla
Co-Authored-By: Claude Opus 5.5 <noreply@anthropic.com>
</commit_message>
<xml_diff>
--- a/docs/entrega-2do-corte/03_Verificacion_y_validacion/Matriz_Criterios_Aceptacion_Pruebas_v1_StockPot.docx
+++ b/docs/entrega-2do-corte/03_Verificacion_y_validacion/Matriz_Criterios_Aceptacion_Pruebas_v1_StockPot.docx
@@ -1385,6 +1385,7 @@
               <w:bottom w:w="60" w:type="dxa"/>
               <w:right w:w="60" w:type="dxa"/>
             </w:tcMar>
+            <w:shd w:val="clear" w:color="auto" w:fill="D4EDDA"/>
           </w:tcPr>
           <w:p>
             <w:pPr>
@@ -1550,6 +1551,7 @@
               <w:bottom w:w="60" w:type="dxa"/>
               <w:right w:w="60" w:type="dxa"/>
             </w:tcMar>
+            <w:shd w:val="clear" w:color="auto" w:fill="D4EDDA"/>
           </w:tcPr>
           <w:p>
             <w:pPr>
@@ -1715,6 +1717,7 @@
               <w:bottom w:w="60" w:type="dxa"/>
               <w:right w:w="60" w:type="dxa"/>
             </w:tcMar>
+            <w:shd w:val="clear" w:color="auto" w:fill="D4EDDA"/>
           </w:tcPr>
           <w:p>
             <w:pPr>
@@ -1880,6 +1883,7 @@
               <w:bottom w:w="60" w:type="dxa"/>
               <w:right w:w="60" w:type="dxa"/>
             </w:tcMar>
+            <w:shd w:val="clear" w:color="auto" w:fill="D4EDDA"/>
           </w:tcPr>
           <w:p>
             <w:pPr>
@@ -2045,6 +2049,7 @@
               <w:bottom w:w="60" w:type="dxa"/>
               <w:right w:w="60" w:type="dxa"/>
             </w:tcMar>
+            <w:shd w:val="clear" w:color="auto" w:fill="D4EDDA"/>
           </w:tcPr>
           <w:p>
             <w:pPr>
@@ -2210,6 +2215,7 @@
               <w:bottom w:w="60" w:type="dxa"/>
               <w:right w:w="60" w:type="dxa"/>
             </w:tcMar>
+            <w:shd w:val="clear" w:color="auto" w:fill="D4EDDA"/>
           </w:tcPr>
           <w:p>
             <w:pPr>
@@ -2375,6 +2381,7 @@
               <w:bottom w:w="60" w:type="dxa"/>
               <w:right w:w="60" w:type="dxa"/>
             </w:tcMar>
+            <w:shd w:val="clear" w:color="auto" w:fill="D4EDDA"/>
           </w:tcPr>
           <w:p>
             <w:pPr>
@@ -2540,6 +2547,7 @@
               <w:bottom w:w="60" w:type="dxa"/>
               <w:right w:w="60" w:type="dxa"/>
             </w:tcMar>
+            <w:shd w:val="clear" w:color="auto" w:fill="D4EDDA"/>
           </w:tcPr>
           <w:p>
             <w:pPr>
@@ -2705,6 +2713,7 @@
               <w:bottom w:w="60" w:type="dxa"/>
               <w:right w:w="60" w:type="dxa"/>
             </w:tcMar>
+            <w:shd w:val="clear" w:color="auto" w:fill="D4EDDA"/>
           </w:tcPr>
           <w:p>
             <w:pPr>
@@ -2870,6 +2879,7 @@
               <w:bottom w:w="60" w:type="dxa"/>
               <w:right w:w="60" w:type="dxa"/>
             </w:tcMar>
+            <w:shd w:val="clear" w:color="auto" w:fill="D4EDDA"/>
           </w:tcPr>
           <w:p>
             <w:pPr>
@@ -3247,6 +3257,7 @@
               <w:bottom w:w="60" w:type="dxa"/>
               <w:right w:w="60" w:type="dxa"/>
             </w:tcMar>
+            <w:shd w:val="clear" w:color="auto" w:fill="D4EDDA"/>
           </w:tcPr>
           <w:p>
             <w:pPr>
@@ -3402,6 +3413,7 @@
               <w:bottom w:w="60" w:type="dxa"/>
               <w:right w:w="60" w:type="dxa"/>
             </w:tcMar>
+            <w:shd w:val="clear" w:color="auto" w:fill="D4EDDA"/>
           </w:tcPr>
           <w:p>
             <w:pPr>
@@ -3557,6 +3569,7 @@
               <w:bottom w:w="60" w:type="dxa"/>
               <w:right w:w="60" w:type="dxa"/>
             </w:tcMar>
+            <w:shd w:val="clear" w:color="auto" w:fill="D4EDDA"/>
           </w:tcPr>
           <w:p>
             <w:pPr>
@@ -3712,6 +3725,7 @@
               <w:bottom w:w="60" w:type="dxa"/>
               <w:right w:w="60" w:type="dxa"/>
             </w:tcMar>
+            <w:shd w:val="clear" w:color="auto" w:fill="D4EDDA"/>
           </w:tcPr>
           <w:p>
             <w:pPr>
@@ -3867,6 +3881,7 @@
               <w:bottom w:w="60" w:type="dxa"/>
               <w:right w:w="60" w:type="dxa"/>
             </w:tcMar>
+            <w:shd w:val="clear" w:color="auto" w:fill="D4EDDA"/>
           </w:tcPr>
           <w:p>
             <w:pPr>
@@ -4022,6 +4037,7 @@
               <w:bottom w:w="60" w:type="dxa"/>
               <w:right w:w="60" w:type="dxa"/>
             </w:tcMar>
+            <w:shd w:val="clear" w:color="auto" w:fill="D4EDDA"/>
           </w:tcPr>
           <w:p>
             <w:pPr>
@@ -4177,6 +4193,7 @@
               <w:bottom w:w="60" w:type="dxa"/>
               <w:right w:w="60" w:type="dxa"/>
             </w:tcMar>
+            <w:shd w:val="clear" w:color="auto" w:fill="D4EDDA"/>
           </w:tcPr>
           <w:p>
             <w:pPr>
@@ -4332,6 +4349,7 @@
               <w:bottom w:w="60" w:type="dxa"/>
               <w:right w:w="60" w:type="dxa"/>
             </w:tcMar>
+            <w:shd w:val="clear" w:color="auto" w:fill="D4EDDA"/>
           </w:tcPr>
           <w:p>
             <w:pPr>
@@ -4487,6 +4505,7 @@
               <w:bottom w:w="60" w:type="dxa"/>
               <w:right w:w="60" w:type="dxa"/>
             </w:tcMar>
+            <w:shd w:val="clear" w:color="auto" w:fill="D4EDDA"/>
           </w:tcPr>
           <w:p>
             <w:pPr>

</xml_diff>